<commit_message>
feat: website v1 + workflow CI/CD
</commit_message>
<xml_diff>
--- a/02_Võ Thị Ngọc Anh_btbuoi10.docx
+++ b/02_Võ Thị Ngọc Anh_btbuoi10.docx
@@ -67,6 +67,67 @@
           <w:rFonts w:cs="Times New Roman"/>
           <w:szCs w:val="26"/>
         </w:rPr>
+        <w:drawing>
+          <wp:inline distT="0" distB="0" distL="0" distR="0" wp14:anchorId="3F3139FE" wp14:editId="3068032B">
+            <wp:extent cx="5943600" cy="3118485"/>
+            <wp:effectExtent l="0" t="0" r="0" b="5715"/>
+            <wp:docPr id="1773161148" name="Picture 1" descr="A screenshot of a computer&#10;&#10;Description automatically generated"/>
+            <wp:cNvGraphicFramePr>
+              <a:graphicFrameLocks xmlns:a="http://schemas.openxmlformats.org/drawingml/2006/main" noChangeAspect="1"/>
+            </wp:cNvGraphicFramePr>
+            <a:graphic xmlns:a="http://schemas.openxmlformats.org/drawingml/2006/main">
+              <a:graphicData uri="http://schemas.openxmlformats.org/drawingml/2006/picture">
+                <pic:pic xmlns:pic="http://schemas.openxmlformats.org/drawingml/2006/picture">
+                  <pic:nvPicPr>
+                    <pic:cNvPr id="1773161148" name="Picture 1" descr="A screenshot of a computer&#10;&#10;Description automatically generated"/>
+                    <pic:cNvPicPr/>
+                  </pic:nvPicPr>
+                  <pic:blipFill>
+                    <a:blip r:embed="rId4"/>
+                    <a:stretch>
+                      <a:fillRect/>
+                    </a:stretch>
+                  </pic:blipFill>
+                  <pic:spPr>
+                    <a:xfrm>
+                      <a:off x="0" y="0"/>
+                      <a:ext cx="5943600" cy="3118485"/>
+                    </a:xfrm>
+                    <a:prstGeom prst="rect">
+                      <a:avLst/>
+                    </a:prstGeom>
+                  </pic:spPr>
+                </pic:pic>
+              </a:graphicData>
+            </a:graphic>
+          </wp:inline>
+        </w:drawing>
+      </w:r>
+    </w:p>
+    <w:p>
+      <w:pPr>
+        <w:jc w:val="both"/>
+        <w:rPr>
+          <w:rFonts w:cs="Times New Roman"/>
+          <w:b/>
+          <w:bCs/>
+          <w:szCs w:val="26"/>
+        </w:rPr>
+      </w:pPr>
+    </w:p>
+    <w:p>
+      <w:pPr>
+        <w:jc w:val="both"/>
+        <w:rPr>
+          <w:rFonts w:cs="Times New Roman"/>
+          <w:szCs w:val="26"/>
+        </w:rPr>
+      </w:pPr>
+      <w:r>
+        <w:rPr>
+          <w:rFonts w:cs="Times New Roman"/>
+          <w:szCs w:val="26"/>
+        </w:rPr>
         <w:t>2. Ảnh chụp 2 GitHub Secrets đã tạo (giá trị tự ẩn – chỉ thấy tên)</w:t>
       </w:r>
     </w:p>
@@ -83,6 +144,56 @@
           <w:rFonts w:cs="Times New Roman"/>
           <w:szCs w:val="26"/>
         </w:rPr>
+        <w:drawing>
+          <wp:inline distT="0" distB="0" distL="0" distR="0" wp14:anchorId="6F535FE8" wp14:editId="129135F7">
+            <wp:extent cx="5943600" cy="3105150"/>
+            <wp:effectExtent l="0" t="0" r="0" b="0"/>
+            <wp:docPr id="129556748" name="Picture 1"/>
+            <wp:cNvGraphicFramePr>
+              <a:graphicFrameLocks xmlns:a="http://schemas.openxmlformats.org/drawingml/2006/main" noChangeAspect="1"/>
+            </wp:cNvGraphicFramePr>
+            <a:graphic xmlns:a="http://schemas.openxmlformats.org/drawingml/2006/main">
+              <a:graphicData uri="http://schemas.openxmlformats.org/drawingml/2006/picture">
+                <pic:pic xmlns:pic="http://schemas.openxmlformats.org/drawingml/2006/picture">
+                  <pic:nvPicPr>
+                    <pic:cNvPr id="129556748" name=""/>
+                    <pic:cNvPicPr/>
+                  </pic:nvPicPr>
+                  <pic:blipFill>
+                    <a:blip r:embed="rId5"/>
+                    <a:stretch>
+                      <a:fillRect/>
+                    </a:stretch>
+                  </pic:blipFill>
+                  <pic:spPr>
+                    <a:xfrm>
+                      <a:off x="0" y="0"/>
+                      <a:ext cx="5943600" cy="3105150"/>
+                    </a:xfrm>
+                    <a:prstGeom prst="rect">
+                      <a:avLst/>
+                    </a:prstGeom>
+                  </pic:spPr>
+                </pic:pic>
+              </a:graphicData>
+            </a:graphic>
+          </wp:inline>
+        </w:drawing>
+      </w:r>
+    </w:p>
+    <w:p>
+      <w:pPr>
+        <w:jc w:val="both"/>
+        <w:rPr>
+          <w:rFonts w:cs="Times New Roman"/>
+          <w:szCs w:val="26"/>
+        </w:rPr>
+      </w:pPr>
+      <w:r>
+        <w:rPr>
+          <w:rFonts w:cs="Times New Roman"/>
+          <w:szCs w:val="26"/>
+        </w:rPr>
         <w:t>3. Ảnh chụp tab Actions: ít nhất 2 workflow runs: xanh (v1 và v2)</w:t>
       </w:r>
     </w:p>
@@ -99,6 +210,7 @@
           <w:rFonts w:cs="Times New Roman"/>
           <w:szCs w:val="26"/>
         </w:rPr>
+        <w:lastRenderedPageBreak/>
         <w:t>4. Ảnh chụp log bước "Deploy len S3" có dòng upload: site/index.html to s3://...</w:t>
       </w:r>
     </w:p>
@@ -132,6 +244,56 @@
           <w:szCs w:val="26"/>
         </w:rPr>
         <w:t>6. Ảnh chụp IAM user github-actions-deploy với policy đã gán</w:t>
+      </w:r>
+    </w:p>
+    <w:p>
+      <w:pPr>
+        <w:jc w:val="both"/>
+        <w:rPr>
+          <w:rFonts w:cs="Times New Roman"/>
+          <w:szCs w:val="26"/>
+        </w:rPr>
+      </w:pPr>
+      <w:r>
+        <w:rPr>
+          <w:rFonts w:cs="Times New Roman"/>
+          <w:szCs w:val="26"/>
+        </w:rPr>
+        <w:drawing>
+          <wp:inline distT="0" distB="0" distL="0" distR="0" wp14:anchorId="6EDEA54C" wp14:editId="18FF2257">
+            <wp:extent cx="5943600" cy="3098800"/>
+            <wp:effectExtent l="0" t="0" r="0" b="6350"/>
+            <wp:docPr id="2066430986" name="Picture 1" descr="A screenshot of a computer&#10;&#10;Description automatically generated"/>
+            <wp:cNvGraphicFramePr>
+              <a:graphicFrameLocks xmlns:a="http://schemas.openxmlformats.org/drawingml/2006/main" noChangeAspect="1"/>
+            </wp:cNvGraphicFramePr>
+            <a:graphic xmlns:a="http://schemas.openxmlformats.org/drawingml/2006/main">
+              <a:graphicData uri="http://schemas.openxmlformats.org/drawingml/2006/picture">
+                <pic:pic xmlns:pic="http://schemas.openxmlformats.org/drawingml/2006/picture">
+                  <pic:nvPicPr>
+                    <pic:cNvPr id="2066430986" name="Picture 1" descr="A screenshot of a computer&#10;&#10;Description automatically generated"/>
+                    <pic:cNvPicPr/>
+                  </pic:nvPicPr>
+                  <pic:blipFill>
+                    <a:blip r:embed="rId6"/>
+                    <a:stretch>
+                      <a:fillRect/>
+                    </a:stretch>
+                  </pic:blipFill>
+                  <pic:spPr>
+                    <a:xfrm>
+                      <a:off x="0" y="0"/>
+                      <a:ext cx="5943600" cy="3098800"/>
+                    </a:xfrm>
+                    <a:prstGeom prst="rect">
+                      <a:avLst/>
+                    </a:prstGeom>
+                  </pic:spPr>
+                </pic:pic>
+              </a:graphicData>
+            </a:graphic>
+          </wp:inline>
+        </w:drawing>
       </w:r>
     </w:p>
     <w:p>

</xml_diff>

<commit_message>
feat: nang cap v2
</commit_message>
<xml_diff>
--- a/02_Võ Thị Ngọc Anh_btbuoi10.docx
+++ b/02_Võ Thị Ngọc Anh_btbuoi10.docx
@@ -148,7 +148,7 @@
           <wp:inline distT="0" distB="0" distL="0" distR="0" wp14:anchorId="6F535FE8" wp14:editId="129135F7">
             <wp:extent cx="5943600" cy="3105150"/>
             <wp:effectExtent l="0" t="0" r="0" b="0"/>
-            <wp:docPr id="129556748" name="Picture 1"/>
+            <wp:docPr id="129556748" name="Picture 1" descr="A screenshot of a computer&#10;&#10;Description automatically generated"/>
             <wp:cNvGraphicFramePr>
               <a:graphicFrameLocks xmlns:a="http://schemas.openxmlformats.org/drawingml/2006/main" noChangeAspect="1"/>
             </wp:cNvGraphicFramePr>
@@ -156,7 +156,7 @@
               <a:graphicData uri="http://schemas.openxmlformats.org/drawingml/2006/picture">
                 <pic:pic xmlns:pic="http://schemas.openxmlformats.org/drawingml/2006/picture">
                   <pic:nvPicPr>
-                    <pic:cNvPr id="129556748" name=""/>
+                    <pic:cNvPr id="129556748" name="Picture 1" descr="A screenshot of a computer&#10;&#10;Description automatically generated"/>
                     <pic:cNvPicPr/>
                   </pic:nvPicPr>
                   <pic:blipFill>
@@ -211,6 +211,56 @@
           <w:szCs w:val="26"/>
         </w:rPr>
         <w:lastRenderedPageBreak/>
+        <w:drawing>
+          <wp:inline distT="0" distB="0" distL="0" distR="0" wp14:anchorId="34D2FC9B" wp14:editId="2401DF00">
+            <wp:extent cx="5943600" cy="1987550"/>
+            <wp:effectExtent l="0" t="0" r="0" b="0"/>
+            <wp:docPr id="888587949" name="Picture 1" descr="A screenshot of a computer&#10;&#10;Description automatically generated"/>
+            <wp:cNvGraphicFramePr>
+              <a:graphicFrameLocks xmlns:a="http://schemas.openxmlformats.org/drawingml/2006/main" noChangeAspect="1"/>
+            </wp:cNvGraphicFramePr>
+            <a:graphic xmlns:a="http://schemas.openxmlformats.org/drawingml/2006/main">
+              <a:graphicData uri="http://schemas.openxmlformats.org/drawingml/2006/picture">
+                <pic:pic xmlns:pic="http://schemas.openxmlformats.org/drawingml/2006/picture">
+                  <pic:nvPicPr>
+                    <pic:cNvPr id="888587949" name="Picture 1" descr="A screenshot of a computer&#10;&#10;Description automatically generated"/>
+                    <pic:cNvPicPr/>
+                  </pic:nvPicPr>
+                  <pic:blipFill>
+                    <a:blip r:embed="rId6"/>
+                    <a:stretch>
+                      <a:fillRect/>
+                    </a:stretch>
+                  </pic:blipFill>
+                  <pic:spPr>
+                    <a:xfrm>
+                      <a:off x="0" y="0"/>
+                      <a:ext cx="5943600" cy="1987550"/>
+                    </a:xfrm>
+                    <a:prstGeom prst="rect">
+                      <a:avLst/>
+                    </a:prstGeom>
+                  </pic:spPr>
+                </pic:pic>
+              </a:graphicData>
+            </a:graphic>
+          </wp:inline>
+        </w:drawing>
+      </w:r>
+    </w:p>
+    <w:p>
+      <w:pPr>
+        <w:jc w:val="both"/>
+        <w:rPr>
+          <w:rFonts w:cs="Times New Roman"/>
+          <w:szCs w:val="26"/>
+        </w:rPr>
+      </w:pPr>
+      <w:r>
+        <w:rPr>
+          <w:rFonts w:cs="Times New Roman"/>
+          <w:szCs w:val="26"/>
+        </w:rPr>
         <w:t>4. Ảnh chụp log bước "Deploy len S3" có dòng upload: site/index.html to s3://...</w:t>
       </w:r>
     </w:p>
@@ -227,6 +277,56 @@
           <w:rFonts w:cs="Times New Roman"/>
           <w:szCs w:val="26"/>
         </w:rPr>
+        <w:drawing>
+          <wp:inline distT="0" distB="0" distL="0" distR="0" wp14:anchorId="41FEB864" wp14:editId="7CB3615E">
+            <wp:extent cx="5943600" cy="2736215"/>
+            <wp:effectExtent l="0" t="0" r="0" b="6985"/>
+            <wp:docPr id="1498695366" name="Picture 1" descr="A screenshot of a computer&#10;&#10;Description automatically generated"/>
+            <wp:cNvGraphicFramePr>
+              <a:graphicFrameLocks xmlns:a="http://schemas.openxmlformats.org/drawingml/2006/main" noChangeAspect="1"/>
+            </wp:cNvGraphicFramePr>
+            <a:graphic xmlns:a="http://schemas.openxmlformats.org/drawingml/2006/main">
+              <a:graphicData uri="http://schemas.openxmlformats.org/drawingml/2006/picture">
+                <pic:pic xmlns:pic="http://schemas.openxmlformats.org/drawingml/2006/picture">
+                  <pic:nvPicPr>
+                    <pic:cNvPr id="1498695366" name="Picture 1" descr="A screenshot of a computer&#10;&#10;Description automatically generated"/>
+                    <pic:cNvPicPr/>
+                  </pic:nvPicPr>
+                  <pic:blipFill>
+                    <a:blip r:embed="rId7"/>
+                    <a:stretch>
+                      <a:fillRect/>
+                    </a:stretch>
+                  </pic:blipFill>
+                  <pic:spPr>
+                    <a:xfrm>
+                      <a:off x="0" y="0"/>
+                      <a:ext cx="5943600" cy="2736215"/>
+                    </a:xfrm>
+                    <a:prstGeom prst="rect">
+                      <a:avLst/>
+                    </a:prstGeom>
+                  </pic:spPr>
+                </pic:pic>
+              </a:graphicData>
+            </a:graphic>
+          </wp:inline>
+        </w:drawing>
+      </w:r>
+    </w:p>
+    <w:p>
+      <w:pPr>
+        <w:jc w:val="both"/>
+        <w:rPr>
+          <w:rFonts w:cs="Times New Roman"/>
+          <w:szCs w:val="26"/>
+        </w:rPr>
+      </w:pPr>
+      <w:r>
+        <w:rPr>
+          <w:rFonts w:cs="Times New Roman"/>
+          <w:szCs w:val="26"/>
+        </w:rPr>
         <w:t>5. Ảnh chụp website v2 trên trình duyệt với URL s3-website đầy đủ</w:t>
       </w:r>
     </w:p>
@@ -259,6 +359,7 @@
           <w:rFonts w:cs="Times New Roman"/>
           <w:szCs w:val="26"/>
         </w:rPr>
+        <w:lastRenderedPageBreak/>
         <w:drawing>
           <wp:inline distT="0" distB="0" distL="0" distR="0" wp14:anchorId="6EDEA54C" wp14:editId="18FF2257">
             <wp:extent cx="5943600" cy="3098800"/>
@@ -275,7 +376,7 @@
                     <pic:cNvPicPr/>
                   </pic:nvPicPr>
                   <pic:blipFill>
-                    <a:blip r:embed="rId6"/>
+                    <a:blip r:embed="rId8"/>
                     <a:stretch>
                       <a:fillRect/>
                     </a:stretch>

</xml_diff>